<commit_message>
Added information to retrospective
Updated information and added my files to the sprint
retrospective.
</commit_message>
<xml_diff>
--- a/sprints/sprint3/Retrospective/Sprint Retrospective Report.docx
+++ b/sprints/sprint3/Retrospective/Sprint Retrospective Report.docx
@@ -1261,13 +1261,26 @@
           <w:tcPr>
             <w:tcW w:w="1615" w:type="dxa"/>
           </w:tcPr>
-          <w:p/>
+          <w:p>
+            <w:r>
+              <w:t>Yeni</w:t>
+            </w:r>
+          </w:p>
         </w:tc>
         <w:tc>
           <w:tcPr>
             <w:tcW w:w="7735" w:type="dxa"/>
           </w:tcPr>
-          <w:p/>
+          <w:p>
+            <w:r>
+              <w:t>Creating and account issue #66</w:t>
+            </w:r>
+          </w:p>
+          <w:p>
+            <w:r>
+              <w:t>Can't create an account because system says user is missing a food log but user does not have one since the account is being created.</w:t>
+            </w:r>
+          </w:p>
         </w:tc>
       </w:tr>
       <w:tr>
@@ -1275,13 +1288,32 @@
           <w:tcPr>
             <w:tcW w:w="1615" w:type="dxa"/>
           </w:tcPr>
-          <w:p/>
+          <w:p>
+            <w:r>
+              <w:t>Yeni</w:t>
+            </w:r>
+          </w:p>
         </w:tc>
         <w:tc>
           <w:tcPr>
             <w:tcW w:w="7735" w:type="dxa"/>
           </w:tcPr>
-          <w:p/>
+          <w:p>
+            <w:r>
+              <w:t xml:space="preserve">Food </w:t>
+            </w:r>
+            <w:r>
+              <w:t>c</w:t>
+            </w:r>
+            <w:r>
+              <w:t>an’t be removed #65</w:t>
+            </w:r>
+          </w:p>
+          <w:p>
+            <w:r>
+              <w:t>Asks user if food want to be removed but when they click yes it does not remove the food item from the log or UI.</w:t>
+            </w:r>
+          </w:p>
         </w:tc>
       </w:tr>
       <w:tr>
@@ -1688,10 +1720,6 @@
     <w:p>
       <w:pPr>
         <w:pStyle w:val="ListParagraph"/>
-        <w:numPr>
-          <w:ilvl w:val="0"/>
-          <w:numId w:val="4"/>
-        </w:numPr>
         <w:rPr>
           <w:b/>
           <w:bCs/>
@@ -1770,10 +1798,6 @@
     <w:p>
       <w:pPr>
         <w:pStyle w:val="ListParagraph"/>
-        <w:numPr>
-          <w:ilvl w:val="0"/>
-          <w:numId w:val="5"/>
-        </w:numPr>
         <w:rPr>
           <w:b/>
           <w:bCs/>
@@ -1861,20 +1885,17 @@
     <w:p>
       <w:pPr>
         <w:pStyle w:val="ListParagraph"/>
-        <w:numPr>
-          <w:ilvl w:val="0"/>
-          <w:numId w:val="6"/>
-        </w:numPr>
-        <w:rPr>
-          <w:b/>
-          <w:bCs/>
-        </w:rPr>
-      </w:pPr>
-      <w:r>
-        <w:rPr>
-          <w:b/>
-          <w:bCs/>
-        </w:rPr>
+        <w:rPr>
+          <w:b/>
+          <w:bCs/>
+        </w:rPr>
+      </w:pPr>
+      <w:r>
+        <w:rPr>
+          <w:b/>
+          <w:bCs/>
+        </w:rPr>
+        <w:lastRenderedPageBreak/>
         <w:br/>
       </w:r>
     </w:p>
@@ -1937,22 +1958,228 @@
           <w:b/>
           <w:bCs/>
         </w:rPr>
-        <w:lastRenderedPageBreak/>
         <w:t>Updated the test cases for the whole python project to make sure it reached good coverage and all tests pass.</w:t>
       </w:r>
+    </w:p>
+    <w:p>
+      <w:pPr>
+        <w:ind w:left="360"/>
+        <w:rPr>
+          <w:b/>
+          <w:bCs/>
+        </w:rPr>
+      </w:pPr>
     </w:p>
     <w:p>
       <w:pPr>
         <w:pStyle w:val="ListParagraph"/>
         <w:numPr>
           <w:ilvl w:val="0"/>
-          <w:numId w:val="7"/>
+          <w:numId w:val="8"/>
         </w:numPr>
         <w:rPr>
           <w:b/>
           <w:bCs/>
         </w:rPr>
       </w:pPr>
+      <w:r>
+        <w:rPr>
+          <w:b/>
+          <w:bCs/>
+        </w:rPr>
+        <w:t>Yeni Almanza</w:t>
+      </w:r>
+    </w:p>
+    <w:p>
+      <w:pPr>
+        <w:pStyle w:val="ListParagraph"/>
+        <w:numPr>
+          <w:ilvl w:val="0"/>
+          <w:numId w:val="8"/>
+        </w:numPr>
+        <w:rPr>
+          <w:b/>
+          <w:bCs/>
+        </w:rPr>
+      </w:pPr>
+      <w:r>
+        <w:rPr>
+          <w:b/>
+          <w:bCs/>
+        </w:rPr>
+        <w:t xml:space="preserve">YA - </w:t>
+      </w:r>
+      <w:r>
+        <w:rPr>
+          <w:b/>
+          <w:bCs/>
+        </w:rPr>
+        <w:t>Replace Logout Button</w:t>
+      </w:r>
+    </w:p>
+    <w:p>
+      <w:pPr>
+        <w:pStyle w:val="ListParagraph"/>
+        <w:numPr>
+          <w:ilvl w:val="0"/>
+          <w:numId w:val="8"/>
+        </w:numPr>
+        <w:rPr>
+          <w:b/>
+          <w:bCs/>
+        </w:rPr>
+      </w:pPr>
+      <w:r>
+        <w:rPr>
+          <w:b/>
+          <w:bCs/>
+        </w:rPr>
+        <w:t>commit efed0a06a0895cfda06a56992184feb909f04c8d</w:t>
+      </w:r>
+    </w:p>
+    <w:p>
+      <w:pPr>
+        <w:pStyle w:val="ListParagraph"/>
+        <w:rPr>
+          <w:b/>
+          <w:bCs/>
+        </w:rPr>
+      </w:pPr>
+      <w:r>
+        <w:rPr>
+          <w:b/>
+          <w:bCs/>
+        </w:rPr>
+        <w:t xml:space="preserve">Didn’t use </w:t>
+      </w:r>
+      <w:r>
+        <w:rPr>
+          <w:b/>
+          <w:bCs/>
+        </w:rPr>
+        <w:t xml:space="preserve">the provided files because </w:t>
+      </w:r>
+      <w:r>
+        <w:rPr>
+          <w:b/>
+          <w:bCs/>
+        </w:rPr>
+        <w:t xml:space="preserve">it was easier to just add sections of code into the existing </w:t>
+      </w:r>
+      <w:proofErr w:type="spellStart"/>
+      <w:r>
+        <w:rPr>
+          <w:b/>
+          <w:bCs/>
+        </w:rPr>
+        <w:t>fxml</w:t>
+      </w:r>
+      <w:proofErr w:type="spellEnd"/>
+      <w:r>
+        <w:rPr>
+          <w:b/>
+          <w:bCs/>
+        </w:rPr>
+        <w:t xml:space="preserve"> than creating new </w:t>
+      </w:r>
+      <w:proofErr w:type="spellStart"/>
+      <w:r>
+        <w:rPr>
+          <w:b/>
+          <w:bCs/>
+        </w:rPr>
+        <w:t>fxml</w:t>
+      </w:r>
+      <w:proofErr w:type="spellEnd"/>
+      <w:r>
+        <w:rPr>
+          <w:b/>
+          <w:bCs/>
+        </w:rPr>
+        <w:t xml:space="preserve"> pages</w:t>
+      </w:r>
+      <w:r>
+        <w:rPr>
+          <w:b/>
+          <w:bCs/>
+        </w:rPr>
+        <w:t>.</w:t>
+      </w:r>
+    </w:p>
+    <w:p>
+      <w:pPr>
+        <w:rPr>
+          <w:b/>
+          <w:bCs/>
+        </w:rPr>
+      </w:pPr>
+    </w:p>
+    <w:p>
+      <w:pPr>
+        <w:pStyle w:val="ListParagraph"/>
+        <w:numPr>
+          <w:ilvl w:val="0"/>
+          <w:numId w:val="9"/>
+        </w:numPr>
+        <w:rPr>
+          <w:b/>
+          <w:bCs/>
+        </w:rPr>
+      </w:pPr>
+      <w:r>
+        <w:rPr>
+          <w:b/>
+          <w:bCs/>
+        </w:rPr>
+        <w:t>Yeni Almanza</w:t>
+      </w:r>
+    </w:p>
+    <w:p>
+      <w:pPr>
+        <w:pStyle w:val="ListParagraph"/>
+        <w:numPr>
+          <w:ilvl w:val="0"/>
+          <w:numId w:val="9"/>
+        </w:numPr>
+        <w:rPr>
+          <w:b/>
+          <w:bCs/>
+        </w:rPr>
+      </w:pPr>
+      <w:r>
+        <w:rPr>
+          <w:b/>
+          <w:bCs/>
+        </w:rPr>
+        <w:t xml:space="preserve">YA - </w:t>
+      </w:r>
+      <w:r>
+        <w:rPr>
+          <w:b/>
+          <w:bCs/>
+        </w:rPr>
+        <w:t>Added missing tests</w:t>
+      </w:r>
+    </w:p>
+    <w:p>
+      <w:pPr>
+        <w:pStyle w:val="ListParagraph"/>
+        <w:numPr>
+          <w:ilvl w:val="0"/>
+          <w:numId w:val="9"/>
+        </w:numPr>
+        <w:rPr>
+          <w:b/>
+          <w:bCs/>
+        </w:rPr>
+      </w:pPr>
+      <w:r>
+        <w:rPr>
+          <w:b/>
+          <w:bCs/>
+        </w:rPr>
+        <w:t>commit fcb0e0219dc9b7d21e00463b16789295c9c2f58a</w:t>
+      </w:r>
     </w:p>
     <w:sectPr>
       <w:pgSz w:w="12240" w:h="15840"/>
@@ -2080,6 +2307,95 @@
     </w:lvl>
   </w:abstractNum>
   <w:abstractNum w:abstractNumId="1" w15:restartNumberingAfterBreak="0">
+    <w:nsid w:val="4333314A"/>
+    <w:multiLevelType w:val="hybridMultilevel"/>
+    <w:tmpl w:val="24B4855E"/>
+    <w:lvl w:ilvl="0" w:tplc="0409000F">
+      <w:start w:val="1"/>
+      <w:numFmt w:val="decimal"/>
+      <w:lvlText w:val="%1."/>
+      <w:lvlJc w:val="left"/>
+      <w:pPr>
+        <w:ind w:left="720" w:hanging="360"/>
+      </w:pPr>
+      <w:rPr>
+        <w:rFonts w:hint="default"/>
+      </w:rPr>
+    </w:lvl>
+    <w:lvl w:ilvl="1" w:tplc="04090019" w:tentative="1">
+      <w:start w:val="1"/>
+      <w:numFmt w:val="lowerLetter"/>
+      <w:lvlText w:val="%2."/>
+      <w:lvlJc w:val="left"/>
+      <w:pPr>
+        <w:ind w:left="1440" w:hanging="360"/>
+      </w:pPr>
+    </w:lvl>
+    <w:lvl w:ilvl="2" w:tplc="0409001B" w:tentative="1">
+      <w:start w:val="1"/>
+      <w:numFmt w:val="lowerRoman"/>
+      <w:lvlText w:val="%3."/>
+      <w:lvlJc w:val="right"/>
+      <w:pPr>
+        <w:ind w:left="2160" w:hanging="180"/>
+      </w:pPr>
+    </w:lvl>
+    <w:lvl w:ilvl="3" w:tplc="0409000F" w:tentative="1">
+      <w:start w:val="1"/>
+      <w:numFmt w:val="decimal"/>
+      <w:lvlText w:val="%4."/>
+      <w:lvlJc w:val="left"/>
+      <w:pPr>
+        <w:ind w:left="2880" w:hanging="360"/>
+      </w:pPr>
+    </w:lvl>
+    <w:lvl w:ilvl="4" w:tplc="04090019" w:tentative="1">
+      <w:start w:val="1"/>
+      <w:numFmt w:val="lowerLetter"/>
+      <w:lvlText w:val="%5."/>
+      <w:lvlJc w:val="left"/>
+      <w:pPr>
+        <w:ind w:left="3600" w:hanging="360"/>
+      </w:pPr>
+    </w:lvl>
+    <w:lvl w:ilvl="5" w:tplc="0409001B" w:tentative="1">
+      <w:start w:val="1"/>
+      <w:numFmt w:val="lowerRoman"/>
+      <w:lvlText w:val="%6."/>
+      <w:lvlJc w:val="right"/>
+      <w:pPr>
+        <w:ind w:left="4320" w:hanging="180"/>
+      </w:pPr>
+    </w:lvl>
+    <w:lvl w:ilvl="6" w:tplc="0409000F" w:tentative="1">
+      <w:start w:val="1"/>
+      <w:numFmt w:val="decimal"/>
+      <w:lvlText w:val="%7."/>
+      <w:lvlJc w:val="left"/>
+      <w:pPr>
+        <w:ind w:left="5040" w:hanging="360"/>
+      </w:pPr>
+    </w:lvl>
+    <w:lvl w:ilvl="7" w:tplc="04090019" w:tentative="1">
+      <w:start w:val="1"/>
+      <w:numFmt w:val="lowerLetter"/>
+      <w:lvlText w:val="%8."/>
+      <w:lvlJc w:val="left"/>
+      <w:pPr>
+        <w:ind w:left="5760" w:hanging="360"/>
+      </w:pPr>
+    </w:lvl>
+    <w:lvl w:ilvl="8" w:tplc="0409001B" w:tentative="1">
+      <w:start w:val="1"/>
+      <w:numFmt w:val="lowerRoman"/>
+      <w:lvlText w:val="%9."/>
+      <w:lvlJc w:val="right"/>
+      <w:pPr>
+        <w:ind w:left="6480" w:hanging="180"/>
+      </w:pPr>
+    </w:lvl>
+  </w:abstractNum>
+  <w:abstractNum w:abstractNumId="2" w15:restartNumberingAfterBreak="0">
     <w:nsid w:val="5BD5494F"/>
     <w:multiLevelType w:val="hybridMultilevel"/>
     <w:tmpl w:val="1DD6E0B2"/>
@@ -2192,7 +2508,96 @@
       </w:rPr>
     </w:lvl>
   </w:abstractNum>
-  <w:abstractNum w:abstractNumId="2" w15:restartNumberingAfterBreak="0">
+  <w:abstractNum w:abstractNumId="3" w15:restartNumberingAfterBreak="0">
+    <w:nsid w:val="653728D8"/>
+    <w:multiLevelType w:val="hybridMultilevel"/>
+    <w:tmpl w:val="EC7CF780"/>
+    <w:lvl w:ilvl="0" w:tplc="0409000F">
+      <w:start w:val="1"/>
+      <w:numFmt w:val="decimal"/>
+      <w:lvlText w:val="%1."/>
+      <w:lvlJc w:val="left"/>
+      <w:pPr>
+        <w:ind w:left="720" w:hanging="360"/>
+      </w:pPr>
+      <w:rPr>
+        <w:rFonts w:hint="default"/>
+      </w:rPr>
+    </w:lvl>
+    <w:lvl w:ilvl="1" w:tplc="04090019" w:tentative="1">
+      <w:start w:val="1"/>
+      <w:numFmt w:val="lowerLetter"/>
+      <w:lvlText w:val="%2."/>
+      <w:lvlJc w:val="left"/>
+      <w:pPr>
+        <w:ind w:left="1440" w:hanging="360"/>
+      </w:pPr>
+    </w:lvl>
+    <w:lvl w:ilvl="2" w:tplc="0409001B" w:tentative="1">
+      <w:start w:val="1"/>
+      <w:numFmt w:val="lowerRoman"/>
+      <w:lvlText w:val="%3."/>
+      <w:lvlJc w:val="right"/>
+      <w:pPr>
+        <w:ind w:left="2160" w:hanging="180"/>
+      </w:pPr>
+    </w:lvl>
+    <w:lvl w:ilvl="3" w:tplc="0409000F" w:tentative="1">
+      <w:start w:val="1"/>
+      <w:numFmt w:val="decimal"/>
+      <w:lvlText w:val="%4."/>
+      <w:lvlJc w:val="left"/>
+      <w:pPr>
+        <w:ind w:left="2880" w:hanging="360"/>
+      </w:pPr>
+    </w:lvl>
+    <w:lvl w:ilvl="4" w:tplc="04090019" w:tentative="1">
+      <w:start w:val="1"/>
+      <w:numFmt w:val="lowerLetter"/>
+      <w:lvlText w:val="%5."/>
+      <w:lvlJc w:val="left"/>
+      <w:pPr>
+        <w:ind w:left="3600" w:hanging="360"/>
+      </w:pPr>
+    </w:lvl>
+    <w:lvl w:ilvl="5" w:tplc="0409001B" w:tentative="1">
+      <w:start w:val="1"/>
+      <w:numFmt w:val="lowerRoman"/>
+      <w:lvlText w:val="%6."/>
+      <w:lvlJc w:val="right"/>
+      <w:pPr>
+        <w:ind w:left="4320" w:hanging="180"/>
+      </w:pPr>
+    </w:lvl>
+    <w:lvl w:ilvl="6" w:tplc="0409000F" w:tentative="1">
+      <w:start w:val="1"/>
+      <w:numFmt w:val="decimal"/>
+      <w:lvlText w:val="%7."/>
+      <w:lvlJc w:val="left"/>
+      <w:pPr>
+        <w:ind w:left="5040" w:hanging="360"/>
+      </w:pPr>
+    </w:lvl>
+    <w:lvl w:ilvl="7" w:tplc="04090019" w:tentative="1">
+      <w:start w:val="1"/>
+      <w:numFmt w:val="lowerLetter"/>
+      <w:lvlText w:val="%8."/>
+      <w:lvlJc w:val="left"/>
+      <w:pPr>
+        <w:ind w:left="5760" w:hanging="360"/>
+      </w:pPr>
+    </w:lvl>
+    <w:lvl w:ilvl="8" w:tplc="0409001B" w:tentative="1">
+      <w:start w:val="1"/>
+      <w:numFmt w:val="lowerRoman"/>
+      <w:lvlText w:val="%9."/>
+      <w:lvlJc w:val="right"/>
+      <w:pPr>
+        <w:ind w:left="6480" w:hanging="180"/>
+      </w:pPr>
+    </w:lvl>
+  </w:abstractNum>
+  <w:abstractNum w:abstractNumId="4" w15:restartNumberingAfterBreak="0">
     <w:nsid w:val="668A11D6"/>
     <w:multiLevelType w:val="hybridMultilevel"/>
     <w:tmpl w:val="6994D41A"/>
@@ -2281,7 +2686,7 @@
       </w:pPr>
     </w:lvl>
   </w:abstractNum>
-  <w:abstractNum w:abstractNumId="3" w15:restartNumberingAfterBreak="0">
+  <w:abstractNum w:abstractNumId="5" w15:restartNumberingAfterBreak="0">
     <w:nsid w:val="6E516E1F"/>
     <w:multiLevelType w:val="hybridMultilevel"/>
     <w:tmpl w:val="D0F4CA2E"/>
@@ -2370,7 +2775,7 @@
       </w:pPr>
     </w:lvl>
   </w:abstractNum>
-  <w:abstractNum w:abstractNumId="4" w15:restartNumberingAfterBreak="0">
+  <w:abstractNum w:abstractNumId="6" w15:restartNumberingAfterBreak="0">
     <w:nsid w:val="70320985"/>
     <w:multiLevelType w:val="hybridMultilevel"/>
     <w:tmpl w:val="CC848A0E"/>
@@ -2459,7 +2864,7 @@
       </w:pPr>
     </w:lvl>
   </w:abstractNum>
-  <w:abstractNum w:abstractNumId="5" w15:restartNumberingAfterBreak="0">
+  <w:abstractNum w:abstractNumId="7" w15:restartNumberingAfterBreak="0">
     <w:nsid w:val="73490412"/>
     <w:multiLevelType w:val="hybridMultilevel"/>
     <w:tmpl w:val="C13246B0"/>
@@ -2545,7 +2950,7 @@
       </w:pPr>
     </w:lvl>
   </w:abstractNum>
-  <w:abstractNum w:abstractNumId="6" w15:restartNumberingAfterBreak="0">
+  <w:abstractNum w:abstractNumId="8" w15:restartNumberingAfterBreak="0">
     <w:nsid w:val="7E45748C"/>
     <w:multiLevelType w:val="hybridMultilevel"/>
     <w:tmpl w:val="61CE851A"/>
@@ -2635,25 +3040,31 @@
     </w:lvl>
   </w:abstractNum>
   <w:num w:numId="1" w16cid:durableId="1946616894">
-    <w:abstractNumId w:val="1"/>
+    <w:abstractNumId w:val="2"/>
   </w:num>
   <w:num w:numId="2" w16cid:durableId="1180314976">
     <w:abstractNumId w:val="0"/>
   </w:num>
   <w:num w:numId="3" w16cid:durableId="1022049856">
+    <w:abstractNumId w:val="7"/>
+  </w:num>
+  <w:num w:numId="4" w16cid:durableId="1663387597">
+    <w:abstractNumId w:val="4"/>
+  </w:num>
+  <w:num w:numId="5" w16cid:durableId="1551307572">
     <w:abstractNumId w:val="5"/>
   </w:num>
-  <w:num w:numId="4" w16cid:durableId="1663387597">
-    <w:abstractNumId w:val="2"/>
-  </w:num>
-  <w:num w:numId="5" w16cid:durableId="1551307572">
-    <w:abstractNumId w:val="3"/>
-  </w:num>
   <w:num w:numId="6" w16cid:durableId="71047148">
-    <w:abstractNumId w:val="4"/>
+    <w:abstractNumId w:val="6"/>
   </w:num>
   <w:num w:numId="7" w16cid:durableId="1135029358">
-    <w:abstractNumId w:val="6"/>
+    <w:abstractNumId w:val="8"/>
+  </w:num>
+  <w:num w:numId="8" w16cid:durableId="666903681">
+    <w:abstractNumId w:val="1"/>
+  </w:num>
+  <w:num w:numId="9" w16cid:durableId="1205097103">
+    <w:abstractNumId w:val="3"/>
   </w:num>
 </w:numbering>
 </file>

</xml_diff>

<commit_message>
Update Retrospective - Victor
</commit_message>
<xml_diff>
--- a/sprints/sprint3/Retrospective/Sprint Retrospective Report.docx
+++ b/sprints/sprint3/Retrospective/Sprint Retrospective Report.docx
@@ -321,23 +321,55 @@
                 <w:rFonts w:ascii="Calibri" w:hAnsi="Calibri" w:cs="Calibri"/>
                 <w:color w:val="000000"/>
               </w:rPr>
-              <w:t xml:space="preserve">Update </w:t>
-            </w:r>
-            <w:proofErr w:type="spellStart"/>
+              <w:t>Update FoodLog Process Client Side</w:t>
+            </w:r>
+          </w:p>
+        </w:tc>
+        <w:tc>
+          <w:tcPr>
+            <w:tcW w:w="1530" w:type="dxa"/>
+            <w:vAlign w:val="bottom"/>
+          </w:tcPr>
+          <w:p>
             <w:r>
               <w:rPr>
                 <w:rFonts w:ascii="Calibri" w:hAnsi="Calibri" w:cs="Calibri"/>
                 <w:color w:val="000000"/>
               </w:rPr>
-              <w:t>FoodLog</w:t>
-            </w:r>
-            <w:proofErr w:type="spellEnd"/>
+              <w:t>Yeni</w:t>
+            </w:r>
+          </w:p>
+        </w:tc>
+        <w:tc>
+          <w:tcPr>
+            <w:tcW w:w="1639" w:type="dxa"/>
+          </w:tcPr>
+          <w:p>
+            <w:r>
+              <w:t>Complete</w:t>
+            </w:r>
+          </w:p>
+        </w:tc>
+        <w:tc>
+          <w:tcPr>
+            <w:tcW w:w="2316" w:type="dxa"/>
+          </w:tcPr>
+          <w:p/>
+        </w:tc>
+      </w:tr>
+      <w:tr>
+        <w:tc>
+          <w:tcPr>
+            <w:tcW w:w="3865" w:type="dxa"/>
+            <w:vAlign w:val="bottom"/>
+          </w:tcPr>
+          <w:p>
             <w:r>
               <w:rPr>
                 <w:rFonts w:ascii="Calibri" w:hAnsi="Calibri" w:cs="Calibri"/>
                 <w:color w:val="000000"/>
               </w:rPr>
-              <w:t xml:space="preserve"> Process Client Side</w:t>
+              <w:t>Update FoodLog Process Server Side</w:t>
             </w:r>
           </w:p>
         </w:tc>
@@ -352,7 +384,7 @@
                 <w:rFonts w:ascii="Calibri" w:hAnsi="Calibri" w:cs="Calibri"/>
                 <w:color w:val="000000"/>
               </w:rPr>
-              <w:t>Yeni</w:t>
+              <w:t>Justin</w:t>
             </w:r>
           </w:p>
         </w:tc>
@@ -385,23 +417,55 @@
                 <w:rFonts w:ascii="Calibri" w:hAnsi="Calibri" w:cs="Calibri"/>
                 <w:color w:val="000000"/>
               </w:rPr>
-              <w:t xml:space="preserve">Update </w:t>
-            </w:r>
-            <w:proofErr w:type="spellStart"/>
+              <w:t>Add Food Codebehind</w:t>
+            </w:r>
+          </w:p>
+        </w:tc>
+        <w:tc>
+          <w:tcPr>
+            <w:tcW w:w="1530" w:type="dxa"/>
+            <w:vAlign w:val="bottom"/>
+          </w:tcPr>
+          <w:p>
             <w:r>
               <w:rPr>
                 <w:rFonts w:ascii="Calibri" w:hAnsi="Calibri" w:cs="Calibri"/>
                 <w:color w:val="000000"/>
               </w:rPr>
-              <w:t>FoodLog</w:t>
-            </w:r>
-            <w:proofErr w:type="spellEnd"/>
+              <w:t>Yeni</w:t>
+            </w:r>
+          </w:p>
+        </w:tc>
+        <w:tc>
+          <w:tcPr>
+            <w:tcW w:w="1639" w:type="dxa"/>
+          </w:tcPr>
+          <w:p>
+            <w:r>
+              <w:t>Complete</w:t>
+            </w:r>
+          </w:p>
+        </w:tc>
+        <w:tc>
+          <w:tcPr>
+            <w:tcW w:w="2316" w:type="dxa"/>
+          </w:tcPr>
+          <w:p/>
+        </w:tc>
+      </w:tr>
+      <w:tr>
+        <w:tc>
+          <w:tcPr>
+            <w:tcW w:w="3865" w:type="dxa"/>
+            <w:vAlign w:val="bottom"/>
+          </w:tcPr>
+          <w:p>
             <w:r>
               <w:rPr>
                 <w:rFonts w:ascii="Calibri" w:hAnsi="Calibri" w:cs="Calibri"/>
                 <w:color w:val="000000"/>
               </w:rPr>
-              <w:t xml:space="preserve"> Process Server Side</w:t>
+              <w:t>Change Date of Food Log Client Side</w:t>
             </w:r>
           </w:p>
         </w:tc>
@@ -416,7 +480,7 @@
                 <w:rFonts w:ascii="Calibri" w:hAnsi="Calibri" w:cs="Calibri"/>
                 <w:color w:val="000000"/>
               </w:rPr>
-              <w:t>Justin</w:t>
+              <w:t>Emi</w:t>
             </w:r>
           </w:p>
         </w:tc>
@@ -449,17 +513,62 @@
                 <w:rFonts w:ascii="Calibri" w:hAnsi="Calibri" w:cs="Calibri"/>
                 <w:color w:val="000000"/>
               </w:rPr>
-              <w:t xml:space="preserve">Add Food </w:t>
-            </w:r>
-            <w:proofErr w:type="spellStart"/>
-            <w:r>
+              <w:t>Change Date of Food Log Server Side</w:t>
+            </w:r>
+          </w:p>
+        </w:tc>
+        <w:tc>
+          <w:tcPr>
+            <w:tcW w:w="1530" w:type="dxa"/>
+            <w:vAlign w:val="bottom"/>
+          </w:tcPr>
+          <w:p>
+            <w:pPr>
               <w:rPr>
                 <w:rFonts w:ascii="Calibri" w:hAnsi="Calibri" w:cs="Calibri"/>
                 <w:color w:val="000000"/>
               </w:rPr>
-              <w:t>Codebehind</w:t>
-            </w:r>
-            <w:proofErr w:type="spellEnd"/>
+            </w:pPr>
+            <w:r>
+              <w:rPr>
+                <w:rFonts w:ascii="Calibri" w:hAnsi="Calibri" w:cs="Calibri"/>
+                <w:color w:val="000000"/>
+              </w:rPr>
+              <w:t>Justin</w:t>
+            </w:r>
+          </w:p>
+        </w:tc>
+        <w:tc>
+          <w:tcPr>
+            <w:tcW w:w="1639" w:type="dxa"/>
+          </w:tcPr>
+          <w:p>
+            <w:r>
+              <w:t>Complete</w:t>
+            </w:r>
+          </w:p>
+        </w:tc>
+        <w:tc>
+          <w:tcPr>
+            <w:tcW w:w="2316" w:type="dxa"/>
+          </w:tcPr>
+          <w:p/>
+        </w:tc>
+      </w:tr>
+      <w:tr>
+        <w:tc>
+          <w:tcPr>
+            <w:tcW w:w="3865" w:type="dxa"/>
+            <w:vAlign w:val="bottom"/>
+          </w:tcPr>
+          <w:p>
+            <w:r>
+              <w:rPr>
+                <w:rFonts w:ascii="Calibri" w:hAnsi="Calibri" w:cs="Calibri"/>
+                <w:color w:val="000000"/>
+              </w:rPr>
+              <w:t>Update HomeDashboard UI</w:t>
+            </w:r>
           </w:p>
         </w:tc>
         <w:tc>
@@ -473,7 +582,7 @@
                 <w:rFonts w:ascii="Calibri" w:hAnsi="Calibri" w:cs="Calibri"/>
                 <w:color w:val="000000"/>
               </w:rPr>
-              <w:t>Yeni</w:t>
+              <w:t>Justin</w:t>
             </w:r>
           </w:p>
         </w:tc>
@@ -506,7 +615,7 @@
                 <w:rFonts w:ascii="Calibri" w:hAnsi="Calibri" w:cs="Calibri"/>
                 <w:color w:val="000000"/>
               </w:rPr>
-              <w:t>Change Date of Food Log Client Side</w:t>
+              <w:t>Create Calculations Model</w:t>
             </w:r>
           </w:p>
         </w:tc>
@@ -554,7 +663,7 @@
                 <w:rFonts w:ascii="Calibri" w:hAnsi="Calibri" w:cs="Calibri"/>
                 <w:color w:val="000000"/>
               </w:rPr>
-              <w:t>Change Date of Food Log Server Side</w:t>
+              <w:t>Update HomeDashboard Codebehind</w:t>
             </w:r>
           </w:p>
         </w:tc>
@@ -564,18 +673,66 @@
             <w:vAlign w:val="bottom"/>
           </w:tcPr>
           <w:p>
-            <w:pPr>
+            <w:r>
               <w:rPr>
                 <w:rFonts w:ascii="Calibri" w:hAnsi="Calibri" w:cs="Calibri"/>
                 <w:color w:val="000000"/>
               </w:rPr>
-            </w:pPr>
+              <w:t>Yeni</w:t>
+            </w:r>
+          </w:p>
+        </w:tc>
+        <w:tc>
+          <w:tcPr>
+            <w:tcW w:w="1639" w:type="dxa"/>
+          </w:tcPr>
+          <w:p>
+            <w:r>
+              <w:t>Complete</w:t>
+            </w:r>
+          </w:p>
+        </w:tc>
+        <w:tc>
+          <w:tcPr>
+            <w:tcW w:w="2316" w:type="dxa"/>
+          </w:tcPr>
+          <w:p/>
+        </w:tc>
+      </w:tr>
+      <w:tr>
+        <w:tc>
+          <w:tcPr>
+            <w:tcW w:w="3865" w:type="dxa"/>
+            <w:vAlign w:val="bottom"/>
+          </w:tcPr>
+          <w:p>
             <w:r>
               <w:rPr>
                 <w:rFonts w:ascii="Calibri" w:hAnsi="Calibri" w:cs="Calibri"/>
                 <w:color w:val="000000"/>
               </w:rPr>
-              <w:t>Justin</w:t>
+              <w:t>Account Menu UI</w:t>
+            </w:r>
+          </w:p>
+        </w:tc>
+        <w:tc>
+          <w:tcPr>
+            <w:tcW w:w="1530" w:type="dxa"/>
+            <w:vAlign w:val="bottom"/>
+          </w:tcPr>
+          <w:p>
+            <w:pPr>
+              <w:rPr>
+                <w:rFonts w:ascii="Calibri" w:hAnsi="Calibri" w:cs="Calibri"/>
+                <w:color w:val="000000"/>
+              </w:rPr>
+            </w:pPr>
+            <w:r>
+              <w:rPr>
+                <w:rFonts w:ascii="Calibri" w:hAnsi="Calibri" w:cs="Calibri"/>
+                <w:color w:val="000000"/>
+              </w:rPr>
+              <w:t>Yeni</w:t>
             </w:r>
           </w:p>
         </w:tc>
@@ -608,23 +765,55 @@
                 <w:rFonts w:ascii="Calibri" w:hAnsi="Calibri" w:cs="Calibri"/>
                 <w:color w:val="000000"/>
               </w:rPr>
-              <w:t xml:space="preserve">Update </w:t>
-            </w:r>
-            <w:proofErr w:type="spellStart"/>
+              <w:t>Edit Diet Process Client Side</w:t>
+            </w:r>
+          </w:p>
+        </w:tc>
+        <w:tc>
+          <w:tcPr>
+            <w:tcW w:w="1530" w:type="dxa"/>
+            <w:vAlign w:val="bottom"/>
+          </w:tcPr>
+          <w:p>
             <w:r>
               <w:rPr>
                 <w:rFonts w:ascii="Calibri" w:hAnsi="Calibri" w:cs="Calibri"/>
                 <w:color w:val="000000"/>
               </w:rPr>
-              <w:t>HomeDashboard</w:t>
-            </w:r>
-            <w:proofErr w:type="spellEnd"/>
+              <w:t>Justin</w:t>
+            </w:r>
+          </w:p>
+        </w:tc>
+        <w:tc>
+          <w:tcPr>
+            <w:tcW w:w="1639" w:type="dxa"/>
+          </w:tcPr>
+          <w:p>
+            <w:r>
+              <w:t>Complete</w:t>
+            </w:r>
+          </w:p>
+        </w:tc>
+        <w:tc>
+          <w:tcPr>
+            <w:tcW w:w="2316" w:type="dxa"/>
+          </w:tcPr>
+          <w:p/>
+        </w:tc>
+      </w:tr>
+      <w:tr>
+        <w:tc>
+          <w:tcPr>
+            <w:tcW w:w="3865" w:type="dxa"/>
+            <w:vAlign w:val="bottom"/>
+          </w:tcPr>
+          <w:p>
             <w:r>
               <w:rPr>
                 <w:rFonts w:ascii="Calibri" w:hAnsi="Calibri" w:cs="Calibri"/>
                 <w:color w:val="000000"/>
               </w:rPr>
-              <w:t xml:space="preserve"> UI</w:t>
+              <w:t>Edit Diet Process Server Side</w:t>
             </w:r>
           </w:p>
         </w:tc>
@@ -634,11 +823,17 @@
             <w:vAlign w:val="bottom"/>
           </w:tcPr>
           <w:p>
-            <w:r>
+            <w:pPr>
               <w:rPr>
                 <w:rFonts w:ascii="Calibri" w:hAnsi="Calibri" w:cs="Calibri"/>
                 <w:color w:val="000000"/>
               </w:rPr>
+            </w:pPr>
+            <w:r>
+              <w:rPr>
+                <w:rFonts w:ascii="Calibri" w:hAnsi="Calibri" w:cs="Calibri"/>
+                <w:color w:val="000000"/>
+              </w:rPr>
               <w:t>Justin</w:t>
             </w:r>
           </w:p>
@@ -672,7 +867,7 @@
                 <w:rFonts w:ascii="Calibri" w:hAnsi="Calibri" w:cs="Calibri"/>
                 <w:color w:val="000000"/>
               </w:rPr>
-              <w:t>Create Calculations Model</w:t>
+              <w:t>Edit Diet UI Page</w:t>
             </w:r>
           </w:p>
         </w:tc>
@@ -682,12 +877,18 @@
             <w:vAlign w:val="bottom"/>
           </w:tcPr>
           <w:p>
-            <w:r>
+            <w:pPr>
               <w:rPr>
                 <w:rFonts w:ascii="Calibri" w:hAnsi="Calibri" w:cs="Calibri"/>
                 <w:color w:val="000000"/>
               </w:rPr>
-              <w:t>Emi</w:t>
+            </w:pPr>
+            <w:r>
+              <w:rPr>
+                <w:rFonts w:ascii="Calibri" w:hAnsi="Calibri" w:cs="Calibri"/>
+                <w:color w:val="000000"/>
+              </w:rPr>
+              <w:t>Yeni</w:t>
             </w:r>
           </w:p>
         </w:tc>
@@ -720,300 +921,8 @@
                 <w:rFonts w:ascii="Calibri" w:hAnsi="Calibri" w:cs="Calibri"/>
                 <w:color w:val="000000"/>
               </w:rPr>
-              <w:t xml:space="preserve">Update </w:t>
-            </w:r>
-            <w:proofErr w:type="spellStart"/>
-            <w:r>
-              <w:rPr>
-                <w:rFonts w:ascii="Calibri" w:hAnsi="Calibri" w:cs="Calibri"/>
-                <w:color w:val="000000"/>
-              </w:rPr>
-              <w:t>HomeDashboard</w:t>
-            </w:r>
-            <w:proofErr w:type="spellEnd"/>
-            <w:r>
-              <w:rPr>
-                <w:rFonts w:ascii="Calibri" w:hAnsi="Calibri" w:cs="Calibri"/>
-                <w:color w:val="000000"/>
-              </w:rPr>
-              <w:t xml:space="preserve"> </w:t>
-            </w:r>
-            <w:proofErr w:type="spellStart"/>
-            <w:r>
-              <w:rPr>
-                <w:rFonts w:ascii="Calibri" w:hAnsi="Calibri" w:cs="Calibri"/>
-                <w:color w:val="000000"/>
-              </w:rPr>
-              <w:t>Codebehind</w:t>
-            </w:r>
-            <w:proofErr w:type="spellEnd"/>
-          </w:p>
-        </w:tc>
-        <w:tc>
-          <w:tcPr>
-            <w:tcW w:w="1530" w:type="dxa"/>
-            <w:vAlign w:val="bottom"/>
-          </w:tcPr>
-          <w:p>
-            <w:r>
-              <w:rPr>
-                <w:rFonts w:ascii="Calibri" w:hAnsi="Calibri" w:cs="Calibri"/>
-                <w:color w:val="000000"/>
-              </w:rPr>
-              <w:t>Yeni</w:t>
-            </w:r>
-          </w:p>
-        </w:tc>
-        <w:tc>
-          <w:tcPr>
-            <w:tcW w:w="1639" w:type="dxa"/>
-          </w:tcPr>
-          <w:p>
-            <w:r>
-              <w:t>Complete</w:t>
-            </w:r>
-          </w:p>
-        </w:tc>
-        <w:tc>
-          <w:tcPr>
-            <w:tcW w:w="2316" w:type="dxa"/>
-          </w:tcPr>
-          <w:p/>
-        </w:tc>
-      </w:tr>
-      <w:tr>
-        <w:tc>
-          <w:tcPr>
-            <w:tcW w:w="3865" w:type="dxa"/>
-            <w:vAlign w:val="bottom"/>
-          </w:tcPr>
-          <w:p>
-            <w:r>
-              <w:rPr>
-                <w:rFonts w:ascii="Calibri" w:hAnsi="Calibri" w:cs="Calibri"/>
-                <w:color w:val="000000"/>
-              </w:rPr>
-              <w:t>Account Menu UI</w:t>
-            </w:r>
-          </w:p>
-        </w:tc>
-        <w:tc>
-          <w:tcPr>
-            <w:tcW w:w="1530" w:type="dxa"/>
-            <w:vAlign w:val="bottom"/>
-          </w:tcPr>
-          <w:p>
-            <w:pPr>
-              <w:rPr>
-                <w:rFonts w:ascii="Calibri" w:hAnsi="Calibri" w:cs="Calibri"/>
-                <w:color w:val="000000"/>
-              </w:rPr>
-            </w:pPr>
-            <w:r>
-              <w:rPr>
-                <w:rFonts w:ascii="Calibri" w:hAnsi="Calibri" w:cs="Calibri"/>
-                <w:color w:val="000000"/>
-              </w:rPr>
-              <w:t>Yeni</w:t>
-            </w:r>
-          </w:p>
-        </w:tc>
-        <w:tc>
-          <w:tcPr>
-            <w:tcW w:w="1639" w:type="dxa"/>
-          </w:tcPr>
-          <w:p>
-            <w:r>
-              <w:t>Complete</w:t>
-            </w:r>
-          </w:p>
-        </w:tc>
-        <w:tc>
-          <w:tcPr>
-            <w:tcW w:w="2316" w:type="dxa"/>
-          </w:tcPr>
-          <w:p/>
-        </w:tc>
-      </w:tr>
-      <w:tr>
-        <w:tc>
-          <w:tcPr>
-            <w:tcW w:w="3865" w:type="dxa"/>
-            <w:vAlign w:val="bottom"/>
-          </w:tcPr>
-          <w:p>
-            <w:r>
-              <w:rPr>
-                <w:rFonts w:ascii="Calibri" w:hAnsi="Calibri" w:cs="Calibri"/>
-                <w:color w:val="000000"/>
-              </w:rPr>
-              <w:t>Edit Diet Process Client Side</w:t>
-            </w:r>
-          </w:p>
-        </w:tc>
-        <w:tc>
-          <w:tcPr>
-            <w:tcW w:w="1530" w:type="dxa"/>
-            <w:vAlign w:val="bottom"/>
-          </w:tcPr>
-          <w:p>
-            <w:r>
-              <w:rPr>
-                <w:rFonts w:ascii="Calibri" w:hAnsi="Calibri" w:cs="Calibri"/>
-                <w:color w:val="000000"/>
-              </w:rPr>
-              <w:t>Justin</w:t>
-            </w:r>
-          </w:p>
-        </w:tc>
-        <w:tc>
-          <w:tcPr>
-            <w:tcW w:w="1639" w:type="dxa"/>
-          </w:tcPr>
-          <w:p>
-            <w:r>
-              <w:t>Complete</w:t>
-            </w:r>
-          </w:p>
-        </w:tc>
-        <w:tc>
-          <w:tcPr>
-            <w:tcW w:w="2316" w:type="dxa"/>
-          </w:tcPr>
-          <w:p/>
-        </w:tc>
-      </w:tr>
-      <w:tr>
-        <w:tc>
-          <w:tcPr>
-            <w:tcW w:w="3865" w:type="dxa"/>
-            <w:vAlign w:val="bottom"/>
-          </w:tcPr>
-          <w:p>
-            <w:r>
-              <w:rPr>
-                <w:rFonts w:ascii="Calibri" w:hAnsi="Calibri" w:cs="Calibri"/>
-                <w:color w:val="000000"/>
-              </w:rPr>
-              <w:t>Edit Diet Process Server Side</w:t>
-            </w:r>
-          </w:p>
-        </w:tc>
-        <w:tc>
-          <w:tcPr>
-            <w:tcW w:w="1530" w:type="dxa"/>
-            <w:vAlign w:val="bottom"/>
-          </w:tcPr>
-          <w:p>
-            <w:pPr>
-              <w:rPr>
-                <w:rFonts w:ascii="Calibri" w:hAnsi="Calibri" w:cs="Calibri"/>
-                <w:color w:val="000000"/>
-              </w:rPr>
-            </w:pPr>
-            <w:r>
-              <w:rPr>
-                <w:rFonts w:ascii="Calibri" w:hAnsi="Calibri" w:cs="Calibri"/>
-                <w:color w:val="000000"/>
-              </w:rPr>
-              <w:t>Justin</w:t>
-            </w:r>
-          </w:p>
-        </w:tc>
-        <w:tc>
-          <w:tcPr>
-            <w:tcW w:w="1639" w:type="dxa"/>
-          </w:tcPr>
-          <w:p>
-            <w:r>
-              <w:t>Complete</w:t>
-            </w:r>
-          </w:p>
-        </w:tc>
-        <w:tc>
-          <w:tcPr>
-            <w:tcW w:w="2316" w:type="dxa"/>
-          </w:tcPr>
-          <w:p/>
-        </w:tc>
-      </w:tr>
-      <w:tr>
-        <w:tc>
-          <w:tcPr>
-            <w:tcW w:w="3865" w:type="dxa"/>
-            <w:vAlign w:val="bottom"/>
-          </w:tcPr>
-          <w:p>
-            <w:r>
-              <w:rPr>
-                <w:rFonts w:ascii="Calibri" w:hAnsi="Calibri" w:cs="Calibri"/>
-                <w:color w:val="000000"/>
-              </w:rPr>
-              <w:t>Edit Diet UI Page</w:t>
-            </w:r>
-          </w:p>
-        </w:tc>
-        <w:tc>
-          <w:tcPr>
-            <w:tcW w:w="1530" w:type="dxa"/>
-            <w:vAlign w:val="bottom"/>
-          </w:tcPr>
-          <w:p>
-            <w:pPr>
-              <w:rPr>
-                <w:rFonts w:ascii="Calibri" w:hAnsi="Calibri" w:cs="Calibri"/>
-                <w:color w:val="000000"/>
-              </w:rPr>
-            </w:pPr>
-            <w:r>
-              <w:rPr>
-                <w:rFonts w:ascii="Calibri" w:hAnsi="Calibri" w:cs="Calibri"/>
-                <w:color w:val="000000"/>
-              </w:rPr>
-              <w:t>Yeni</w:t>
-            </w:r>
-          </w:p>
-        </w:tc>
-        <w:tc>
-          <w:tcPr>
-            <w:tcW w:w="1639" w:type="dxa"/>
-          </w:tcPr>
-          <w:p>
-            <w:r>
-              <w:t>Complete</w:t>
-            </w:r>
-          </w:p>
-        </w:tc>
-        <w:tc>
-          <w:tcPr>
-            <w:tcW w:w="2316" w:type="dxa"/>
-          </w:tcPr>
-          <w:p/>
-        </w:tc>
-      </w:tr>
-      <w:tr>
-        <w:tc>
-          <w:tcPr>
-            <w:tcW w:w="3865" w:type="dxa"/>
-            <w:vAlign w:val="bottom"/>
-          </w:tcPr>
-          <w:p>
-            <w:r>
-              <w:rPr>
-                <w:rFonts w:ascii="Calibri" w:hAnsi="Calibri" w:cs="Calibri"/>
-                <w:color w:val="000000"/>
-              </w:rPr>
-              <w:t xml:space="preserve">Edit Diet </w:t>
-            </w:r>
-            <w:proofErr w:type="spellStart"/>
-            <w:r>
-              <w:rPr>
-                <w:rFonts w:ascii="Calibri" w:hAnsi="Calibri" w:cs="Calibri"/>
-                <w:color w:val="000000"/>
-              </w:rPr>
-              <w:t>Codebehind</w:t>
-            </w:r>
-            <w:proofErr w:type="spellEnd"/>
+              <w:t>Edit Diet Codebehind</w:t>
+            </w:r>
           </w:p>
         </w:tc>
         <w:tc>
@@ -1314,6 +1223,92 @@
               <w:t>Asks user if food want to be removed but when they click yes it does not remove the food item from the log or UI.</w:t>
             </w:r>
           </w:p>
+        </w:tc>
+      </w:tr>
+      <w:tr>
+        <w:tc>
+          <w:tcPr>
+            <w:tcW w:w="1615" w:type="dxa"/>
+          </w:tcPr>
+          <w:p>
+            <w:r>
+              <w:t>Victor</w:t>
+            </w:r>
+          </w:p>
+        </w:tc>
+        <w:tc>
+          <w:tcPr>
+            <w:tcW w:w="7735" w:type="dxa"/>
+          </w:tcPr>
+          <w:p>
+            <w:r>
+              <w:t>Commit 9ee6cc0: Update HomeDashboardViewModel tests – April 16 2026 @ 7PM</w:t>
+            </w:r>
+          </w:p>
+        </w:tc>
+      </w:tr>
+      <w:tr>
+        <w:tc>
+          <w:tcPr>
+            <w:tcW w:w="1615" w:type="dxa"/>
+          </w:tcPr>
+          <w:p>
+            <w:r>
+              <w:t>Victor</w:t>
+            </w:r>
+          </w:p>
+        </w:tc>
+        <w:tc>
+          <w:tcPr>
+            <w:tcW w:w="7735" w:type="dxa"/>
+          </w:tcPr>
+          <w:p>
+            <w:r>
+              <w:t>I did most of the server-side update day of food task. I accidentally pushed it to the wrong branch. Will finish the task tomorrow.</w:t>
+            </w:r>
+          </w:p>
+        </w:tc>
+      </w:tr>
+      <w:tr>
+        <w:tc>
+          <w:tcPr>
+            <w:tcW w:w="1615" w:type="dxa"/>
+          </w:tcPr>
+          <w:p/>
+        </w:tc>
+        <w:tc>
+          <w:tcPr>
+            <w:tcW w:w="7735" w:type="dxa"/>
+          </w:tcPr>
+          <w:p/>
+        </w:tc>
+      </w:tr>
+      <w:tr>
+        <w:tc>
+          <w:tcPr>
+            <w:tcW w:w="1615" w:type="dxa"/>
+          </w:tcPr>
+          <w:p/>
+        </w:tc>
+        <w:tc>
+          <w:tcPr>
+            <w:tcW w:w="7735" w:type="dxa"/>
+          </w:tcPr>
+          <w:p/>
+        </w:tc>
+      </w:tr>
+      <w:tr>
+        <w:tc>
+          <w:tcPr>
+            <w:tcW w:w="1615" w:type="dxa"/>
+          </w:tcPr>
+          <w:p/>
+        </w:tc>
+        <w:tc>
+          <w:tcPr>
+            <w:tcW w:w="7735" w:type="dxa"/>
+          </w:tcPr>
+          <w:p/>
         </w:tc>
       </w:tr>
       <w:tr>
@@ -1671,7 +1666,6 @@
           <w:bCs/>
         </w:rPr>
       </w:pPr>
-      <w:proofErr w:type="spellStart"/>
       <w:r>
         <w:rPr>
           <w:b/>
@@ -1679,7 +1673,6 @@
         </w:rPr>
         <w:t>EditDietGoalsClientTesting</w:t>
       </w:r>
-      <w:proofErr w:type="spellEnd"/>
     </w:p>
     <w:p>
       <w:pPr>
@@ -1698,23 +1691,7 @@
           <w:b/>
           <w:bCs/>
         </w:rPr>
-        <w:t xml:space="preserve">Creating test cases for the </w:t>
-      </w:r>
-      <w:proofErr w:type="spellStart"/>
-      <w:r>
-        <w:rPr>
-          <w:b/>
-          <w:bCs/>
-        </w:rPr>
-        <w:t>EditDietGoalsRequestHandler</w:t>
-      </w:r>
-      <w:proofErr w:type="spellEnd"/>
-      <w:r>
-        <w:rPr>
-          <w:b/>
-          <w:bCs/>
-        </w:rPr>
-        <w:t xml:space="preserve"> class.</w:t>
+        <w:t>Creating test cases for the EditDietGoalsRequestHandler class.</w:t>
       </w:r>
     </w:p>
     <w:p>
@@ -1765,7 +1742,6 @@
           <w:bCs/>
         </w:rPr>
       </w:pPr>
-      <w:proofErr w:type="spellStart"/>
       <w:r>
         <w:rPr>
           <w:b/>
@@ -1773,7 +1749,6 @@
         </w:rPr>
         <w:t>FullProjectTesting</w:t>
       </w:r>
-      <w:proofErr w:type="spellEnd"/>
     </w:p>
     <w:p>
       <w:pPr>
@@ -1808,6 +1783,7 @@
           <w:b/>
           <w:bCs/>
         </w:rPr>
+        <w:lastRenderedPageBreak/>
         <w:br/>
       </w:r>
     </w:p>
@@ -1843,7 +1819,6 @@
           <w:bCs/>
         </w:rPr>
       </w:pPr>
-      <w:proofErr w:type="spellStart"/>
       <w:r>
         <w:rPr>
           <w:b/>
@@ -1851,7 +1826,6 @@
         </w:rPr>
         <w:t>FixTesting</w:t>
       </w:r>
-      <w:proofErr w:type="spellEnd"/>
     </w:p>
     <w:p>
       <w:pPr>
@@ -1870,17 +1844,8 @@
           <w:b/>
           <w:bCs/>
         </w:rPr>
-        <w:t xml:space="preserve">Updated the current test cases that were failing and added additional test cases for updates made to </w:t>
-      </w:r>
-      <w:proofErr w:type="spellStart"/>
-      <w:r>
-        <w:rPr>
-          <w:b/>
-          <w:bCs/>
-        </w:rPr>
-        <w:t>HomedashboardViewModel</w:t>
-      </w:r>
-      <w:proofErr w:type="spellEnd"/>
+        <w:t>Updated the current test cases that were failing and added additional test cases for updates made to HomedashboardViewModel</w:t>
+      </w:r>
     </w:p>
     <w:p>
       <w:pPr>
@@ -1895,7 +1860,6 @@
           <w:b/>
           <w:bCs/>
         </w:rPr>
-        <w:lastRenderedPageBreak/>
         <w:br/>
       </w:r>
     </w:p>
@@ -1931,7 +1895,6 @@
           <w:bCs/>
         </w:rPr>
       </w:pPr>
-      <w:proofErr w:type="spellStart"/>
       <w:r>
         <w:rPr>
           <w:b/>
@@ -1939,7 +1902,6 @@
         </w:rPr>
         <w:t>UpdatePythonTesting</w:t>
       </w:r>
-      <w:proofErr w:type="spellEnd"/>
     </w:p>
     <w:p>
       <w:pPr>
@@ -2064,39 +2026,7 @@
           <w:b/>
           <w:bCs/>
         </w:rPr>
-        <w:t xml:space="preserve">it was easier to just add sections of code into the existing </w:t>
-      </w:r>
-      <w:proofErr w:type="spellStart"/>
-      <w:r>
-        <w:rPr>
-          <w:b/>
-          <w:bCs/>
-        </w:rPr>
-        <w:t>fxml</w:t>
-      </w:r>
-      <w:proofErr w:type="spellEnd"/>
-      <w:r>
-        <w:rPr>
-          <w:b/>
-          <w:bCs/>
-        </w:rPr>
-        <w:t xml:space="preserve"> than creating new </w:t>
-      </w:r>
-      <w:proofErr w:type="spellStart"/>
-      <w:r>
-        <w:rPr>
-          <w:b/>
-          <w:bCs/>
-        </w:rPr>
-        <w:t>fxml</w:t>
-      </w:r>
-      <w:proofErr w:type="spellEnd"/>
-      <w:r>
-        <w:rPr>
-          <w:b/>
-          <w:bCs/>
-        </w:rPr>
-        <w:t xml:space="preserve"> pages</w:t>
+        <w:t>it was easier to just add sections of code into the existing fxml than creating new fxml pages</w:t>
       </w:r>
       <w:r>
         <w:rPr>
@@ -2179,6 +2109,94 @@
           <w:bCs/>
         </w:rPr>
         <w:t>commit fcb0e0219dc9b7d21e00463b16789295c9c2f58a</w:t>
+      </w:r>
+    </w:p>
+    <w:p>
+      <w:pPr>
+        <w:rPr>
+          <w:b/>
+          <w:bCs/>
+        </w:rPr>
+      </w:pPr>
+    </w:p>
+    <w:p>
+      <w:pPr>
+        <w:pStyle w:val="ListParagraph"/>
+        <w:numPr>
+          <w:ilvl w:val="0"/>
+          <w:numId w:val="10"/>
+        </w:numPr>
+        <w:rPr>
+          <w:b/>
+          <w:bCs/>
+        </w:rPr>
+      </w:pPr>
+      <w:r>
+        <w:rPr>
+          <w:b/>
+          <w:bCs/>
+        </w:rPr>
+        <w:t>Victor Filpo</w:t>
+      </w:r>
+    </w:p>
+    <w:p>
+      <w:pPr>
+        <w:pStyle w:val="ListParagraph"/>
+        <w:numPr>
+          <w:ilvl w:val="0"/>
+          <w:numId w:val="10"/>
+        </w:numPr>
+        <w:rPr>
+          <w:b/>
+          <w:bCs/>
+        </w:rPr>
+      </w:pPr>
+      <w:r>
+        <w:rPr>
+          <w:b/>
+          <w:bCs/>
+        </w:rPr>
+        <w:t>VF-undertanding-the-create-method-header</w:t>
+      </w:r>
+    </w:p>
+    <w:p>
+      <w:pPr>
+        <w:pStyle w:val="ListParagraph"/>
+        <w:numPr>
+          <w:ilvl w:val="0"/>
+          <w:numId w:val="10"/>
+        </w:numPr>
+        <w:rPr>
+          <w:b/>
+          <w:bCs/>
+        </w:rPr>
+      </w:pPr>
+      <w:r>
+        <w:rPr>
+          <w:b/>
+          <w:bCs/>
+        </w:rPr>
+        <w:t>Undertanding sections of my peer’s work, Java testing methods reminders</w:t>
+      </w:r>
+    </w:p>
+    <w:p>
+      <w:pPr>
+        <w:pStyle w:val="ListParagraph"/>
+        <w:numPr>
+          <w:ilvl w:val="0"/>
+          <w:numId w:val="10"/>
+        </w:numPr>
+        <w:rPr>
+          <w:b/>
+          <w:bCs/>
+        </w:rPr>
+      </w:pPr>
+      <w:r>
+        <w:rPr>
+          <w:b/>
+          <w:bCs/>
+        </w:rPr>
+        <w:t>9ee6cc0900db141b7bb0aa5a6fb9c565e2e431ed</w:t>
       </w:r>
     </w:p>
     <w:sectPr>
@@ -2194,6 +2212,95 @@
 <file path=word/numbering.xml><?xml version="1.0" encoding="utf-8"?>
 <w:numbering xmlns:wpc="http://schemas.microsoft.com/office/word/2010/wordprocessingCanvas" xmlns:cx="http://schemas.microsoft.com/office/drawing/2014/chartex" xmlns:cx1="http://schemas.microsoft.com/office/drawing/2015/9/8/chartex" xmlns:cx2="http://schemas.microsoft.com/office/drawing/2015/10/21/chartex" xmlns:cx3="http://schemas.microsoft.com/office/drawing/2016/5/9/chartex" xmlns:cx4="http://schemas.microsoft.com/office/drawing/2016/5/10/chartex" xmlns:cx5="http://schemas.microsoft.com/office/drawing/2016/5/11/chartex" xmlns:cx6="http://schemas.microsoft.com/office/drawing/2016/5/12/chartex" xmlns:cx7="http://schemas.microsoft.com/office/drawing/2016/5/13/chartex" xmlns:cx8="http://schemas.microsoft.com/office/drawing/2016/5/14/chartex" xmlns:mc="http://schemas.openxmlformats.org/markup-compatibility/2006" xmlns:aink="http://schemas.microsoft.com/office/drawing/2016/ink" xmlns:am3d="http://schemas.microsoft.com/office/drawing/2017/model3d" xmlns:o="urn:schemas-microsoft-com:office:office" xmlns:oel="http://schemas.microsoft.com/office/2019/extlst" xmlns:r="http://schemas.openxmlformats.org/officeDocument/2006/relationships" xmlns:m="http://schemas.openxmlformats.org/officeDocument/2006/math" xmlns:v="urn:schemas-microsoft-com:vml" xmlns:wp14="http://schemas.microsoft.com/office/word/2010/wordprocessingDrawing" xmlns:wp="http://schemas.openxmlformats.org/drawingml/2006/wordprocessingDrawing" xmlns:w10="urn:schemas-microsoft-com:office:word" xmlns:w="http://schemas.openxmlformats.org/wordprocessingml/2006/main" xmlns:w14="http://schemas.microsoft.com/office/word/2010/wordml" xmlns:w15="http://schemas.microsoft.com/office/word/2012/wordml" xmlns:w16cex="http://schemas.microsoft.com/office/word/2018/wordml/cex" xmlns:w16cid="http://schemas.microsoft.com/office/word/2016/wordml/cid" xmlns:w16="http://schemas.microsoft.com/office/word/2018/wordml" xmlns:w16du="http://schemas.microsoft.com/office/word/2023/wordml/word16du" xmlns:w16sdtdh="http://schemas.microsoft.com/office/word/2020/wordml/sdtdatahash" xmlns:w16sdtfl="http://schemas.microsoft.com/office/word/2024/wordml/sdtformatlock" xmlns:w16se="http://schemas.microsoft.com/office/word/2015/wordml/symex" xmlns:wpg="http://schemas.microsoft.com/office/word/2010/wordprocessingGroup" xmlns:wpi="http://schemas.microsoft.com/office/word/2010/wordprocessingInk" xmlns:wne="http://schemas.microsoft.com/office/word/2006/wordml" xmlns:wps="http://schemas.microsoft.com/office/word/2010/wordprocessingShape" mc:Ignorable="w14 w15 w16se w16cid w16 w16cex w16sdtdh w16sdtfl w16du wp14">
   <w:abstractNum w:abstractNumId="0" w15:restartNumberingAfterBreak="0">
+    <w:nsid w:val="14D44EF5"/>
+    <w:multiLevelType w:val="hybridMultilevel"/>
+    <w:tmpl w:val="A7C25436"/>
+    <w:lvl w:ilvl="0" w:tplc="0409000F">
+      <w:start w:val="1"/>
+      <w:numFmt w:val="decimal"/>
+      <w:lvlText w:val="%1."/>
+      <w:lvlJc w:val="left"/>
+      <w:pPr>
+        <w:ind w:left="720" w:hanging="360"/>
+      </w:pPr>
+      <w:rPr>
+        <w:rFonts w:hint="default"/>
+      </w:rPr>
+    </w:lvl>
+    <w:lvl w:ilvl="1" w:tplc="04090019" w:tentative="1">
+      <w:start w:val="1"/>
+      <w:numFmt w:val="lowerLetter"/>
+      <w:lvlText w:val="%2."/>
+      <w:lvlJc w:val="left"/>
+      <w:pPr>
+        <w:ind w:left="1440" w:hanging="360"/>
+      </w:pPr>
+    </w:lvl>
+    <w:lvl w:ilvl="2" w:tplc="0409001B" w:tentative="1">
+      <w:start w:val="1"/>
+      <w:numFmt w:val="lowerRoman"/>
+      <w:lvlText w:val="%3."/>
+      <w:lvlJc w:val="right"/>
+      <w:pPr>
+        <w:ind w:left="2160" w:hanging="180"/>
+      </w:pPr>
+    </w:lvl>
+    <w:lvl w:ilvl="3" w:tplc="0409000F" w:tentative="1">
+      <w:start w:val="1"/>
+      <w:numFmt w:val="decimal"/>
+      <w:lvlText w:val="%4."/>
+      <w:lvlJc w:val="left"/>
+      <w:pPr>
+        <w:ind w:left="2880" w:hanging="360"/>
+      </w:pPr>
+    </w:lvl>
+    <w:lvl w:ilvl="4" w:tplc="04090019" w:tentative="1">
+      <w:start w:val="1"/>
+      <w:numFmt w:val="lowerLetter"/>
+      <w:lvlText w:val="%5."/>
+      <w:lvlJc w:val="left"/>
+      <w:pPr>
+        <w:ind w:left="3600" w:hanging="360"/>
+      </w:pPr>
+    </w:lvl>
+    <w:lvl w:ilvl="5" w:tplc="0409001B" w:tentative="1">
+      <w:start w:val="1"/>
+      <w:numFmt w:val="lowerRoman"/>
+      <w:lvlText w:val="%6."/>
+      <w:lvlJc w:val="right"/>
+      <w:pPr>
+        <w:ind w:left="4320" w:hanging="180"/>
+      </w:pPr>
+    </w:lvl>
+    <w:lvl w:ilvl="6" w:tplc="0409000F" w:tentative="1">
+      <w:start w:val="1"/>
+      <w:numFmt w:val="decimal"/>
+      <w:lvlText w:val="%7."/>
+      <w:lvlJc w:val="left"/>
+      <w:pPr>
+        <w:ind w:left="5040" w:hanging="360"/>
+      </w:pPr>
+    </w:lvl>
+    <w:lvl w:ilvl="7" w:tplc="04090019" w:tentative="1">
+      <w:start w:val="1"/>
+      <w:numFmt w:val="lowerLetter"/>
+      <w:lvlText w:val="%8."/>
+      <w:lvlJc w:val="left"/>
+      <w:pPr>
+        <w:ind w:left="5760" w:hanging="360"/>
+      </w:pPr>
+    </w:lvl>
+    <w:lvl w:ilvl="8" w:tplc="0409001B" w:tentative="1">
+      <w:start w:val="1"/>
+      <w:numFmt w:val="lowerRoman"/>
+      <w:lvlText w:val="%9."/>
+      <w:lvlJc w:val="right"/>
+      <w:pPr>
+        <w:ind w:left="6480" w:hanging="180"/>
+      </w:pPr>
+    </w:lvl>
+  </w:abstractNum>
+  <w:abstractNum w:abstractNumId="1" w15:restartNumberingAfterBreak="0">
     <w:nsid w:val="40F1172E"/>
     <w:multiLevelType w:val="hybridMultilevel"/>
     <w:tmpl w:val="ED30E1E8"/>
@@ -2306,7 +2413,7 @@
       </w:rPr>
     </w:lvl>
   </w:abstractNum>
-  <w:abstractNum w:abstractNumId="1" w15:restartNumberingAfterBreak="0">
+  <w:abstractNum w:abstractNumId="2" w15:restartNumberingAfterBreak="0">
     <w:nsid w:val="4333314A"/>
     <w:multiLevelType w:val="hybridMultilevel"/>
     <w:tmpl w:val="24B4855E"/>
@@ -2395,7 +2502,7 @@
       </w:pPr>
     </w:lvl>
   </w:abstractNum>
-  <w:abstractNum w:abstractNumId="2" w15:restartNumberingAfterBreak="0">
+  <w:abstractNum w:abstractNumId="3" w15:restartNumberingAfterBreak="0">
     <w:nsid w:val="5BD5494F"/>
     <w:multiLevelType w:val="hybridMultilevel"/>
     <w:tmpl w:val="1DD6E0B2"/>
@@ -2508,7 +2615,7 @@
       </w:rPr>
     </w:lvl>
   </w:abstractNum>
-  <w:abstractNum w:abstractNumId="3" w15:restartNumberingAfterBreak="0">
+  <w:abstractNum w:abstractNumId="4" w15:restartNumberingAfterBreak="0">
     <w:nsid w:val="653728D8"/>
     <w:multiLevelType w:val="hybridMultilevel"/>
     <w:tmpl w:val="EC7CF780"/>
@@ -2597,7 +2704,7 @@
       </w:pPr>
     </w:lvl>
   </w:abstractNum>
-  <w:abstractNum w:abstractNumId="4" w15:restartNumberingAfterBreak="0">
+  <w:abstractNum w:abstractNumId="5" w15:restartNumberingAfterBreak="0">
     <w:nsid w:val="668A11D6"/>
     <w:multiLevelType w:val="hybridMultilevel"/>
     <w:tmpl w:val="6994D41A"/>
@@ -2686,7 +2793,7 @@
       </w:pPr>
     </w:lvl>
   </w:abstractNum>
-  <w:abstractNum w:abstractNumId="5" w15:restartNumberingAfterBreak="0">
+  <w:abstractNum w:abstractNumId="6" w15:restartNumberingAfterBreak="0">
     <w:nsid w:val="6E516E1F"/>
     <w:multiLevelType w:val="hybridMultilevel"/>
     <w:tmpl w:val="D0F4CA2E"/>
@@ -2775,7 +2882,7 @@
       </w:pPr>
     </w:lvl>
   </w:abstractNum>
-  <w:abstractNum w:abstractNumId="6" w15:restartNumberingAfterBreak="0">
+  <w:abstractNum w:abstractNumId="7" w15:restartNumberingAfterBreak="0">
     <w:nsid w:val="70320985"/>
     <w:multiLevelType w:val="hybridMultilevel"/>
     <w:tmpl w:val="CC848A0E"/>
@@ -2864,7 +2971,7 @@
       </w:pPr>
     </w:lvl>
   </w:abstractNum>
-  <w:abstractNum w:abstractNumId="7" w15:restartNumberingAfterBreak="0">
+  <w:abstractNum w:abstractNumId="8" w15:restartNumberingAfterBreak="0">
     <w:nsid w:val="73490412"/>
     <w:multiLevelType w:val="hybridMultilevel"/>
     <w:tmpl w:val="C13246B0"/>
@@ -2950,7 +3057,7 @@
       </w:pPr>
     </w:lvl>
   </w:abstractNum>
-  <w:abstractNum w:abstractNumId="8" w15:restartNumberingAfterBreak="0">
+  <w:abstractNum w:abstractNumId="9" w15:restartNumberingAfterBreak="0">
     <w:nsid w:val="7E45748C"/>
     <w:multiLevelType w:val="hybridMultilevel"/>
     <w:tmpl w:val="61CE851A"/>
@@ -3040,31 +3147,34 @@
     </w:lvl>
   </w:abstractNum>
   <w:num w:numId="1" w16cid:durableId="1946616894">
+    <w:abstractNumId w:val="3"/>
+  </w:num>
+  <w:num w:numId="2" w16cid:durableId="1180314976">
+    <w:abstractNumId w:val="1"/>
+  </w:num>
+  <w:num w:numId="3" w16cid:durableId="1022049856">
+    <w:abstractNumId w:val="8"/>
+  </w:num>
+  <w:num w:numId="4" w16cid:durableId="1663387597">
+    <w:abstractNumId w:val="5"/>
+  </w:num>
+  <w:num w:numId="5" w16cid:durableId="1551307572">
+    <w:abstractNumId w:val="6"/>
+  </w:num>
+  <w:num w:numId="6" w16cid:durableId="71047148">
+    <w:abstractNumId w:val="7"/>
+  </w:num>
+  <w:num w:numId="7" w16cid:durableId="1135029358">
+    <w:abstractNumId w:val="9"/>
+  </w:num>
+  <w:num w:numId="8" w16cid:durableId="666903681">
     <w:abstractNumId w:val="2"/>
   </w:num>
-  <w:num w:numId="2" w16cid:durableId="1180314976">
-    <w:abstractNumId w:val="0"/>
-  </w:num>
-  <w:num w:numId="3" w16cid:durableId="1022049856">
-    <w:abstractNumId w:val="7"/>
-  </w:num>
-  <w:num w:numId="4" w16cid:durableId="1663387597">
+  <w:num w:numId="9" w16cid:durableId="1205097103">
     <w:abstractNumId w:val="4"/>
   </w:num>
-  <w:num w:numId="5" w16cid:durableId="1551307572">
-    <w:abstractNumId w:val="5"/>
-  </w:num>
-  <w:num w:numId="6" w16cid:durableId="71047148">
-    <w:abstractNumId w:val="6"/>
-  </w:num>
-  <w:num w:numId="7" w16cid:durableId="1135029358">
-    <w:abstractNumId w:val="8"/>
-  </w:num>
-  <w:num w:numId="8" w16cid:durableId="666903681">
-    <w:abstractNumId w:val="1"/>
-  </w:num>
-  <w:num w:numId="9" w16cid:durableId="1205097103">
-    <w:abstractNumId w:val="3"/>
+  <w:num w:numId="10" w16cid:durableId="264462397">
+    <w:abstractNumId w:val="0"/>
   </w:num>
 </w:numbering>
 </file>

</xml_diff>